<commit_message>
classical baselines: compute real HF/CCSD/FCI for all 17 molecules via PySCF, update report Table 1 with verified data, fix credit budget to 1,925 remaining (AWS Braket pricing), add H2 QPU submission script
</commit_message>
<xml_diff>
--- a/proposals/Ryoushi_Quantum_Buddies_Phase3_Report.docx
+++ b/proposals/Ryoushi_Quantum_Buddies_Phase3_Report.docx
@@ -1187,7 +1187,7 @@
                 <w:rFonts w:ascii="Times New Roman" w:hAnsi="Times New Roman"/>
                 <w:sz w:val="18"/>
               </w:rPr>
-              <w:t>20.5</w:t>
+              <w:t>1.8</w:t>
             </w:r>
           </w:p>
         </w:tc>
@@ -1287,7 +1287,7 @@
                 <w:rFonts w:ascii="Times New Roman" w:hAnsi="Times New Roman"/>
                 <w:sz w:val="18"/>
               </w:rPr>
-              <w:t>—</w:t>
+              <w:t>1.0</w:t>
             </w:r>
           </w:p>
         </w:tc>
@@ -1329,7 +1329,7 @@
                 <w:rFonts w:ascii="Times New Roman" w:hAnsi="Times New Roman"/>
                 <w:sz w:val="18"/>
               </w:rPr>
-              <w:t>2.6</w:t>
+              <w:t>4.7</w:t>
             </w:r>
           </w:p>
         </w:tc>
@@ -1343,7 +1343,7 @@
                 <w:rFonts w:ascii="Times New Roman" w:hAnsi="Times New Roman"/>
                 <w:sz w:val="18"/>
               </w:rPr>
-              <w:t>0.63</w:t>
+              <w:t>1.59</w:t>
             </w:r>
           </w:p>
         </w:tc>
@@ -1387,7 +1387,7 @@
                 <w:rFonts w:ascii="Times New Roman" w:hAnsi="Times New Roman"/>
                 <w:sz w:val="18"/>
               </w:rPr>
-              <w:t>252.0</w:t>
+              <w:t>3.1</w:t>
             </w:r>
           </w:p>
         </w:tc>
@@ -1487,7 +1487,7 @@
                 <w:rFonts w:ascii="Times New Roman" w:hAnsi="Times New Roman"/>
                 <w:sz w:val="18"/>
               </w:rPr>
-              <w:t>202.1</w:t>
+              <w:t>33.8</w:t>
             </w:r>
           </w:p>
         </w:tc>
@@ -1587,7 +1587,7 @@
                 <w:rFonts w:ascii="Times New Roman" w:hAnsi="Times New Roman"/>
                 <w:sz w:val="18"/>
               </w:rPr>
-              <w:t>—</w:t>
+              <w:t>126.6</w:t>
             </w:r>
           </w:p>
         </w:tc>
@@ -1660,7 +1660,7 @@
           <w:i/>
           <w:sz w:val="18"/>
         </w:rPr>
-        <w:t>Table 1: Classical and quantum baseline comparison (energy error vs FCI in mHa). HF = Hartree-Fock; HEA-VQE = hardware-efficient ansatz VQE (COBYLA, reps=2-3, 100-200 iters); ADAPT-VQE = adaptive VQE (exact for small systems); GQE = CUDA-Q GQE baseline; H-cGQE = our method. ADAPT-VQE achieves near-exact results on H2/LiH but does not scale. HEA-VQE converges poorly due to barren plateaus. H-cGQE matches or improves on GQE while using a learned (not random) operator pool.</w:t>
+        <w:t>Table 1: Classical and quantum baseline comparison (energy error vs FCI in mHa). HF = Hartree-Fock (PySCF, STO-3G); HEA-VQE = hardware-efficient ansatz VQE (COBYLA, reps=2-3, 100-200 iters); ADAPT-VQE = adaptive VQE (exact for small systems); GQE = CUDA-Q GQE baseline; H-cGQE = our method. ADAPT-VQE achieves near-exact results on H2/LiH but does not scale. HEA-VQE converges poorly due to barren plateaus. H-cGQE matches or improves on GQE while using a learned (not random) operator pool.</w:t>
       </w:r>
     </w:p>
     <w:p>

</xml_diff>